<commit_message>
report update and script
</commit_message>
<xml_diff>
--- a/assignment/report-part2/report_draft_1.0.docx
+++ b/assignment/report-part2/report_draft_1.0.docx
@@ -1,6 +1,6 @@
 
 <file path=word/document.xml><?xml version="1.0" encoding="utf-8"?>
-<w:document xmlns:wpc="http://schemas.microsoft.com/office/word/2010/wordprocessingCanvas" xmlns:cx="http://schemas.microsoft.com/office/drawing/2014/chartex" xmlns:cx1="http://schemas.microsoft.com/office/drawing/2015/9/8/chartex" xmlns:cx2="http://schemas.microsoft.com/office/drawing/2015/10/21/chartex" xmlns:cx3="http://schemas.microsoft.com/office/drawing/2016/5/9/chartex" xmlns:cx4="http://schemas.microsoft.com/office/drawing/2016/5/10/chartex" xmlns:cx5="http://schemas.microsoft.com/office/drawing/2016/5/11/chartex" xmlns:cx6="http://schemas.microsoft.com/office/drawing/2016/5/12/chartex" xmlns:cx7="http://schemas.microsoft.com/office/drawing/2016/5/13/chartex" xmlns:cx8="http://schemas.microsoft.com/office/drawing/2016/5/14/chartex" xmlns:mc="http://schemas.openxmlformats.org/markup-compatibility/2006" xmlns:aink="http://schemas.microsoft.com/office/drawing/2016/ink" xmlns:am3d="http://schemas.microsoft.com/office/drawing/2017/model3d" xmlns:o="urn:schemas-microsoft-com:office:office" xmlns:oel="http://schemas.microsoft.com/office/2019/extlst" xmlns:r="http://schemas.openxmlformats.org/officeDocument/2006/relationships" xmlns:m="http://schemas.openxmlformats.org/officeDocument/2006/math" xmlns:v="urn:schemas-microsoft-com:vml" xmlns:wp14="http://schemas.microsoft.com/office/word/2010/wordprocessingDrawing" xmlns:wp="http://schemas.openxmlformats.org/drawingml/2006/wordprocessingDrawing" xmlns:w10="urn:schemas-microsoft-com:office:word" xmlns:w="http://schemas.openxmlformats.org/wordprocessingml/2006/main" xmlns:w14="http://schemas.microsoft.com/office/word/2010/wordml" xmlns:w15="http://schemas.microsoft.com/office/word/2012/wordml" xmlns:w16cex="http://schemas.microsoft.com/office/word/2018/wordml/cex" xmlns:w16cid="http://schemas.microsoft.com/office/word/2016/wordml/cid" xmlns:w16="http://schemas.microsoft.com/office/word/2018/wordml" xmlns:w16du="http://schemas.microsoft.com/office/word/2023/wordml/word16du" xmlns:w16sdtdh="http://schemas.microsoft.com/office/word/2020/wordml/sdtdatahash" xmlns:w16sdtfl="http://schemas.microsoft.com/office/word/2024/wordml/sdtformatlock" xmlns:w16se="http://schemas.microsoft.com/office/word/2015/wordml/symex" xmlns:wpg="http://schemas.microsoft.com/office/word/2010/wordprocessingGroup" xmlns:wpi="http://schemas.microsoft.com/office/word/2010/wordprocessingInk" xmlns:wne="http://schemas.microsoft.com/office/word/2006/wordml" xmlns:wps="http://schemas.microsoft.com/office/word/2010/wordprocessingShape" mc:Ignorable="w14 w15 w16se w16cid w16 w16cex w16sdtdh w16sdtfl w16du wp14">
+<w:document xmlns:wpc="http://schemas.microsoft.com/office/word/2010/wordprocessingCanvas" xmlns:cx="http://schemas.microsoft.com/office/drawing/2014/chartex" xmlns:cx1="http://schemas.microsoft.com/office/drawing/2015/9/8/chartex" xmlns:cx2="http://schemas.microsoft.com/office/drawing/2015/10/21/chartex" xmlns:cx3="http://schemas.microsoft.com/office/drawing/2016/5/9/chartex" xmlns:cx4="http://schemas.microsoft.com/office/drawing/2016/5/10/chartex" xmlns:cx5="http://schemas.microsoft.com/office/drawing/2016/5/11/chartex" xmlns:cx6="http://schemas.microsoft.com/office/drawing/2016/5/12/chartex" xmlns:cx7="http://schemas.microsoft.com/office/drawing/2016/5/13/chartex" xmlns:cx8="http://schemas.microsoft.com/office/drawing/2016/5/14/chartex" xmlns:mc="http://schemas.openxmlformats.org/markup-compatibility/2006" xmlns:aink="http://schemas.microsoft.com/office/drawing/2016/ink" xmlns:am3d="http://schemas.microsoft.com/office/drawing/2017/model3d" xmlns:o="urn:schemas-microsoft-com:office:office" xmlns:oel="http://schemas.microsoft.com/office/2019/extlst" xmlns:r="http://schemas.openxmlformats.org/officeDocument/2006/relationships" xmlns:m="http://schemas.openxmlformats.org/officeDocument/2006/math" xmlns:v="urn:schemas-microsoft-com:vml" xmlns:wp14="http://schemas.microsoft.com/office/word/2010/wordprocessingDrawing" xmlns:wp="http://schemas.openxmlformats.org/drawingml/2006/wordprocessingDrawing" xmlns:w10="urn:schemas-microsoft-com:office:word" xmlns:w="http://schemas.openxmlformats.org/wordprocessingml/2006/main" xmlns:w14="http://schemas.microsoft.com/office/word/2010/wordml" xmlns:w15="http://schemas.microsoft.com/office/word/2012/wordml" xmlns:w16cex="http://schemas.microsoft.com/office/word/2018/wordml/cex" xmlns:w16cid="http://schemas.microsoft.com/office/word/2016/wordml/cid" xmlns:w16="http://schemas.microsoft.com/office/word/2018/wordml" xmlns:w16du="http://schemas.microsoft.com/office/word/2023/wordml/word16du" xmlns:w16sdtdh="http://schemas.microsoft.com/office/word/2020/wordml/sdtdatahash" xmlns:w16se="http://schemas.microsoft.com/office/word/2015/wordml/symex" xmlns:wpg="http://schemas.microsoft.com/office/word/2010/wordprocessingGroup" xmlns:wpi="http://schemas.microsoft.com/office/word/2010/wordprocessingInk" xmlns:wne="http://schemas.microsoft.com/office/word/2006/wordml" xmlns:wps="http://schemas.microsoft.com/office/word/2010/wordprocessingShape" mc:Ignorable="w14 w15 w16se w16cid w16 w16cex w16sdtdh w16du wp14">
   <w:body>
     <w:p>
       <w:pPr>
@@ -12,21 +12,23 @@
     </w:p>
     <w:p>
       <w:r>
-        <w:t>WC - 63</w:t>
-      </w:r>
-    </w:p>
-    <w:p>
-      <w:r>
-        <w:t xml:space="preserve">This report will cover the implementation of my database design from part one, the database is responsible for storing the data of a new online video games marketplace, positioning itself as a competitor to “Steam”. This report will cover the initial implementation and conversion from a logical entity relationship diagram (ERD), </w:t>
-      </w:r>
-      <w:r>
-        <w:t>v</w:t>
-      </w:r>
-      <w:r>
-        <w:t>arious queries performed on test data and the challenges during this process.</w:t>
-      </w:r>
-      <w:r>
-        <w:t xml:space="preserve"> To write queries, scripts and interact with the database MySQL Workbench was used. </w:t>
+        <w:t xml:space="preserve">WC - </w:t>
+      </w:r>
+      <w:r>
+        <w:t>94</w:t>
+      </w:r>
+    </w:p>
+    <w:p>
+      <w:r>
+        <w:t xml:space="preserve">This report documents the implementation of the relational database designed in part one. The database is responsible for storing and managing the data of a new online video game marketplace, positioned as a competitor to existing platforms such as “Steam”. The report covers the process of converting the logical Entity Relationship Diagram (ERD) into a fully functional MySQL database, alongside the testing and execution of various SQL queries on scripted test data. MySQL Workbench and JetBrains </w:t>
+      </w:r>
+      <w:proofErr w:type="spellStart"/>
+      <w:r>
+        <w:t>DataGrip</w:t>
+      </w:r>
+      <w:proofErr w:type="spellEnd"/>
+      <w:r>
+        <w:t xml:space="preserve"> were used for database design, query writing, and interacting with the database environment during development and testing.</w:t>
       </w:r>
     </w:p>
     <w:p/>
@@ -48,18 +50,21 @@
       <w:r>
         <w:t>WC</w:t>
       </w:r>
-    </w:p>
-    <w:p>
-      <w:r>
-        <w:t>Before I begin, a quick note that my script and data was performed on a dockerized instance of MySQL rather than a local instance directly, in situations where this is relevant, I will show how it was done in this situation and on a local instance.</w:t>
-      </w:r>
-    </w:p>
-    <w:p>
-      <w:r>
-        <w:t xml:space="preserve">The ERD was mostly accurate however was missing some information such as in the ‘message’ table there was no field for the actual content of the message, this was added before continuing. </w:t>
-      </w:r>
-      <w:r>
-        <w:t>MySQL workbench was once used to visualize a final ERD before continuing, this can be updated and used to create scripts and schemas that can be used directly on the database, saving time.</w:t>
+      <w:r>
+        <w:t xml:space="preserve"> - </w:t>
+      </w:r>
+      <w:r>
+        <w:t>197</w:t>
+      </w:r>
+    </w:p>
+    <w:p>
+      <w:r>
+        <w:t>Before continuing, it is important to note that all development and testing was performed on a Dockerized instance of MySQL rather than a local installation. This provided a consistent environment across multiple machines without the need to fully install MySQL on each system. Where relevant, this report will highlight how this affected the development process, particularly when generating and applying database dumps. However, all scripts produced will function correctly on a standard local installation.</w:t>
+      </w:r>
+    </w:p>
+    <w:p>
+      <w:r>
+        <w:t>The ERD produced in part one was largely accurate; however, during implementation, it became clear that some additional attributes were necessary. For example, the message table was missing a field for storing the content of a message, which was added before continuing. MySQL Workbench was used to visualise the updated ERD and assisted in writing the creation scripts for the database schema.</w:t>
       </w:r>
     </w:p>
     <w:p>
@@ -70,10 +75,11 @@
         <w:rPr>
           <w:noProof/>
         </w:rPr>
+        <w:lastRenderedPageBreak/>
         <w:drawing>
-          <wp:inline distT="0" distB="0" distL="0" distR="0" wp14:anchorId="32AD28B1" wp14:editId="2A5128A4">
-            <wp:extent cx="5385688" cy="3296093"/>
-            <wp:effectExtent l="0" t="0" r="0" b="6350"/>
+          <wp:inline distT="0" distB="0" distL="0" distR="0" wp14:anchorId="32AD28B1" wp14:editId="1574C411">
+            <wp:extent cx="5710107" cy="3494638"/>
+            <wp:effectExtent l="0" t="0" r="5080" b="0"/>
             <wp:docPr id="933463379" name="Picture 1" descr="A screenshot of a computer&#10;&#10;AI-generated content may be incorrect."/>
             <wp:cNvGraphicFramePr>
               <a:graphicFrameLocks xmlns:a="http://schemas.openxmlformats.org/drawingml/2006/main" noChangeAspect="1"/>
@@ -86,7 +92,7 @@
                     <pic:cNvPicPr/>
                   </pic:nvPicPr>
                   <pic:blipFill>
-                    <a:blip r:embed="rId4" cstate="print">
+                    <a:blip r:embed="rId5" cstate="print">
                       <a:extLst>
                         <a:ext uri="{28A0092B-C50C-407E-A947-70E740481C1C}">
                           <a14:useLocalDpi xmlns:a14="http://schemas.microsoft.com/office/drawing/2010/main" val="0"/>
@@ -100,7 +106,7 @@
                   <pic:spPr>
                     <a:xfrm>
                       <a:off x="0" y="0"/>
-                      <a:ext cx="5440381" cy="3329565"/>
+                      <a:ext cx="5898731" cy="3610078"/>
                     </a:xfrm>
                     <a:prstGeom prst="rect">
                       <a:avLst/>
@@ -111,15 +117,6 @@
             </a:graphic>
           </wp:inline>
         </w:drawing>
-      </w:r>
-    </w:p>
-    <w:p>
-      <w:r>
-        <w:lastRenderedPageBreak/>
-        <w:t>An example of what the creation script for the account table is shown below</w:t>
-      </w:r>
-      <w:r>
-        <w:t xml:space="preserve">, including how to drop and then use the database (named marketplace), </w:t>
       </w:r>
     </w:p>
     <w:p>
@@ -143,7 +140,7 @@
                     <pic:cNvPicPr/>
                   </pic:nvPicPr>
                   <pic:blipFill>
-                    <a:blip r:embed="rId5">
+                    <a:blip r:embed="rId6">
                       <a:extLst>
                         <a:ext uri="{28A0092B-C50C-407E-A947-70E740481C1C}">
                           <a14:useLocalDpi xmlns:a14="http://schemas.microsoft.com/office/drawing/2010/main" val="0"/>
@@ -178,11 +175,12 @@
         <w:rPr>
           <w:noProof/>
         </w:rPr>
+        <w:lastRenderedPageBreak/>
         <w:drawing>
-          <wp:inline distT="0" distB="0" distL="0" distR="0" wp14:anchorId="5017A21D" wp14:editId="1549CA47">
-            <wp:extent cx="5697708" cy="3891476"/>
-            <wp:effectExtent l="0" t="0" r="5080" b="0"/>
-            <wp:docPr id="603715291" name="Picture 3" descr="A screen shot of a computer screen&#10;&#10;AI-generated content may be incorrect."/>
+          <wp:inline distT="0" distB="0" distL="0" distR="0" wp14:anchorId="462B6827" wp14:editId="4F49C8B9">
+            <wp:extent cx="5667226" cy="4635500"/>
+            <wp:effectExtent l="0" t="0" r="0" b="0"/>
+            <wp:docPr id="973849658" name="Picture 1" descr="A screen shot of a computer code&#10;&#10;AI-generated content may be incorrect."/>
             <wp:cNvGraphicFramePr>
               <a:graphicFrameLocks xmlns:a="http://schemas.openxmlformats.org/drawingml/2006/main" noChangeAspect="1"/>
             </wp:cNvGraphicFramePr>
@@ -190,11 +188,11 @@
               <a:graphicData uri="http://schemas.openxmlformats.org/drawingml/2006/picture">
                 <pic:pic xmlns:pic="http://schemas.openxmlformats.org/drawingml/2006/picture">
                   <pic:nvPicPr>
-                    <pic:cNvPr id="603715291" name="Picture 3" descr="A screen shot of a computer screen&#10;&#10;AI-generated content may be incorrect."/>
+                    <pic:cNvPr id="973849658" name="Picture 1" descr="A screen shot of a computer code&#10;&#10;AI-generated content may be incorrect."/>
                     <pic:cNvPicPr/>
                   </pic:nvPicPr>
                   <pic:blipFill>
-                    <a:blip r:embed="rId6">
+                    <a:blip r:embed="rId7">
                       <a:extLst>
                         <a:ext uri="{28A0092B-C50C-407E-A947-70E740481C1C}">
                           <a14:useLocalDpi xmlns:a14="http://schemas.microsoft.com/office/drawing/2010/main" val="0"/>
@@ -208,7 +206,7 @@
                   <pic:spPr>
                     <a:xfrm>
                       <a:off x="0" y="0"/>
-                      <a:ext cx="5758335" cy="3932884"/>
+                      <a:ext cx="5692558" cy="4656220"/>
                     </a:xfrm>
                     <a:prstGeom prst="rect">
                       <a:avLst/>
@@ -222,16 +220,539 @@
       </w:r>
     </w:p>
     <w:p>
+      <w:r>
+        <w:t xml:space="preserve">Several changes were made to the original ERD, including the addition of two new attributes in the account table: </w:t>
+      </w:r>
+      <w:proofErr w:type="spellStart"/>
+      <w:r>
+        <w:t>active_account</w:t>
+      </w:r>
+      <w:proofErr w:type="spellEnd"/>
+      <w:r>
+        <w:t xml:space="preserve"> and </w:t>
+      </w:r>
+      <w:proofErr w:type="spellStart"/>
+      <w:r>
+        <w:t>deleted_on</w:t>
+      </w:r>
+      <w:proofErr w:type="spellEnd"/>
+      <w:r>
+        <w:t>. These were implemented to support soft deletion of user accounts for legal or data retention purposes. Additionally, unique constraints were added to the email and username fields within the account table to enforce data integrity and prevent duplicate accounts.</w:t>
+      </w:r>
+    </w:p>
+    <w:p/>
+    <w:p/>
+    <w:p>
       <w:pPr>
+        <w:pStyle w:val="Heading2"/>
+      </w:pPr>
+      <w:r>
+        <w:t>Implementation Decisions</w:t>
+      </w:r>
+    </w:p>
+    <w:p>
+      <w:r>
+        <w:t xml:space="preserve">WC - </w:t>
+      </w:r>
+      <w:r>
+        <w:t>255</w:t>
+      </w:r>
+    </w:p>
+    <w:p>
+      <w:r>
+        <w:t xml:space="preserve">The database schema was created incrementally, beginning with core entities such as account, followed by dependent tables like publisher, game, and review, which utilise </w:t>
+      </w:r>
+      <w:proofErr w:type="spellStart"/>
+      <w:r>
+        <w:t>account_id</w:t>
+      </w:r>
+      <w:proofErr w:type="spellEnd"/>
+      <w:r>
+        <w:t xml:space="preserve"> as a foreign key. Relationships and foreign key constraints were introduced only after their respective tables had been defined, ensuring there were no dependency issues during creation.</w:t>
+      </w:r>
+    </w:p>
+    <w:p>
+      <w:r>
+        <w:t xml:space="preserve">Indexes were applied carefully to improve query performance, particularly on foreign key columns and fields requiring uniqueness, such as email, username, and </w:t>
+      </w:r>
+      <w:proofErr w:type="spellStart"/>
+      <w:r>
+        <w:lastRenderedPageBreak/>
+        <w:t>publisher_id</w:t>
+      </w:r>
+      <w:proofErr w:type="spellEnd"/>
+      <w:r>
+        <w:t xml:space="preserve">. Secondary indexes were created on commonly queried attributes such as </w:t>
+      </w:r>
+      <w:proofErr w:type="spellStart"/>
+      <w:r>
+        <w:t>publisher_admin</w:t>
+      </w:r>
+      <w:proofErr w:type="spellEnd"/>
+      <w:r>
+        <w:t xml:space="preserve"> in the publisher table and </w:t>
+      </w:r>
+      <w:proofErr w:type="spellStart"/>
+      <w:r>
+        <w:t>written_by</w:t>
+      </w:r>
+      <w:proofErr w:type="spellEnd"/>
+      <w:r>
+        <w:t xml:space="preserve"> in the review table, improving the performance of joins and lookups.</w:t>
+      </w:r>
+    </w:p>
+    <w:p>
+      <w:r>
+        <w:t xml:space="preserve">A </w:t>
+      </w:r>
+      <w:proofErr w:type="spellStart"/>
+      <w:r>
+        <w:t>public_account</w:t>
+      </w:r>
+      <w:proofErr w:type="spellEnd"/>
+      <w:r>
+        <w:t xml:space="preserve"> view was implemented to hide sensitive data such as email addresses and password hashes, while still allowing public profile information to be queried safely. Several stored procedures were developed to handle common operations, including updating profile pictures, retrieving friends lists, and finding shared or unowned games. More complex queries made use of Common Table Expressions (CTEs), using WITH ... AS (...) syntax to break down multi-step queries into manageable parts, improving both readability and maintainability.</w:t>
+      </w:r>
+    </w:p>
+    <w:p/>
+    <w:p>
+      <w:r>
         <w:rPr>
-          <w:b/>
-          <w:bCs/>
+          <w:noProof/>
         </w:rPr>
+        <w:drawing>
+          <wp:inline distT="0" distB="0" distL="0" distR="0" wp14:anchorId="2B28E2A3" wp14:editId="7E00ED1A">
+            <wp:extent cx="5881057" cy="4445000"/>
+            <wp:effectExtent l="0" t="0" r="0" b="0"/>
+            <wp:docPr id="1301184972" name="Picture 2" descr="A screenshot of a computer program&#10;&#10;AI-generated content may be incorrect."/>
+            <wp:cNvGraphicFramePr>
+              <a:graphicFrameLocks xmlns:a="http://schemas.openxmlformats.org/drawingml/2006/main" noChangeAspect="1"/>
+            </wp:cNvGraphicFramePr>
+            <a:graphic xmlns:a="http://schemas.openxmlformats.org/drawingml/2006/main">
+              <a:graphicData uri="http://schemas.openxmlformats.org/drawingml/2006/picture">
+                <pic:pic xmlns:pic="http://schemas.openxmlformats.org/drawingml/2006/picture">
+                  <pic:nvPicPr>
+                    <pic:cNvPr id="1301184972" name="Picture 2" descr="A screenshot of a computer program&#10;&#10;AI-generated content may be incorrect."/>
+                    <pic:cNvPicPr/>
+                  </pic:nvPicPr>
+                  <pic:blipFill>
+                    <a:blip r:embed="rId8" cstate="print">
+                      <a:extLst>
+                        <a:ext uri="{28A0092B-C50C-407E-A947-70E740481C1C}">
+                          <a14:useLocalDpi xmlns:a14="http://schemas.microsoft.com/office/drawing/2010/main" val="0"/>
+                        </a:ext>
+                      </a:extLst>
+                    </a:blip>
+                    <a:stretch>
+                      <a:fillRect/>
+                    </a:stretch>
+                  </pic:blipFill>
+                  <pic:spPr>
+                    <a:xfrm>
+                      <a:off x="0" y="0"/>
+                      <a:ext cx="5893873" cy="4454686"/>
+                    </a:xfrm>
+                    <a:prstGeom prst="rect">
+                      <a:avLst/>
+                    </a:prstGeom>
+                  </pic:spPr>
+                </pic:pic>
+              </a:graphicData>
+            </a:graphic>
+          </wp:inline>
+        </w:drawing>
+      </w:r>
+    </w:p>
+    <w:p>
+      <w:r>
+        <w:t xml:space="preserve">Role-based access control was implemented using MySQL GRANT statements. Three roles were created: </w:t>
+      </w:r>
+      <w:proofErr w:type="spellStart"/>
+      <w:r>
+        <w:t>market_admin</w:t>
+      </w:r>
+      <w:proofErr w:type="spellEnd"/>
+      <w:r>
+        <w:t xml:space="preserve"> (full privileges, localhost-only access), </w:t>
+      </w:r>
+      <w:proofErr w:type="spellStart"/>
+      <w:r>
+        <w:t>app_user</w:t>
+      </w:r>
+      <w:proofErr w:type="spellEnd"/>
+      <w:r>
+        <w:t xml:space="preserve"> (read/write, restricted from schema changes), and </w:t>
+      </w:r>
+      <w:proofErr w:type="spellStart"/>
+      <w:r>
+        <w:t>readonly_user</w:t>
+      </w:r>
+      <w:proofErr w:type="spellEnd"/>
+      <w:r>
+        <w:t xml:space="preserve"> (SELECT only). Referential integrity was enforced through foreign keys with varying cascading behaviours. For example, ON DELETE CASCADE was used for child records in review and </w:t>
+      </w:r>
+      <w:proofErr w:type="spellStart"/>
+      <w:r>
+        <w:t>account_games</w:t>
+      </w:r>
+      <w:proofErr w:type="spellEnd"/>
+      <w:r>
+        <w:t xml:space="preserve">, while ON DELETE SET NULL was applied where preserving data contextually made sense, such as the </w:t>
+      </w:r>
+      <w:proofErr w:type="spellStart"/>
+      <w:r>
+        <w:t>publisher_admin</w:t>
+      </w:r>
+      <w:proofErr w:type="spellEnd"/>
+      <w:r>
+        <w:t xml:space="preserve"> field in the publisher table.</w:t>
+      </w:r>
+    </w:p>
+    <w:p>
+      <w:r>
+        <w:rPr>
+          <w:noProof/>
+        </w:rPr>
+        <w:lastRenderedPageBreak/>
+        <w:drawing>
+          <wp:inline distT="0" distB="0" distL="0" distR="0" wp14:anchorId="5B304FE8" wp14:editId="3B927E38">
+            <wp:extent cx="5731510" cy="2073910"/>
+            <wp:effectExtent l="0" t="0" r="0" b="0"/>
+            <wp:docPr id="2111983873" name="Picture 3" descr="A screen shot of a computer screen&#10;&#10;AI-generated content may be incorrect."/>
+            <wp:cNvGraphicFramePr>
+              <a:graphicFrameLocks xmlns:a="http://schemas.openxmlformats.org/drawingml/2006/main" noChangeAspect="1"/>
+            </wp:cNvGraphicFramePr>
+            <a:graphic xmlns:a="http://schemas.openxmlformats.org/drawingml/2006/main">
+              <a:graphicData uri="http://schemas.openxmlformats.org/drawingml/2006/picture">
+                <pic:pic xmlns:pic="http://schemas.openxmlformats.org/drawingml/2006/picture">
+                  <pic:nvPicPr>
+                    <pic:cNvPr id="2111983873" name="Picture 3" descr="A screen shot of a computer screen&#10;&#10;AI-generated content may be incorrect."/>
+                    <pic:cNvPicPr/>
+                  </pic:nvPicPr>
+                  <pic:blipFill>
+                    <a:blip r:embed="rId9" cstate="print">
+                      <a:extLst>
+                        <a:ext uri="{28A0092B-C50C-407E-A947-70E740481C1C}">
+                          <a14:useLocalDpi xmlns:a14="http://schemas.microsoft.com/office/drawing/2010/main" val="0"/>
+                        </a:ext>
+                      </a:extLst>
+                    </a:blip>
+                    <a:stretch>
+                      <a:fillRect/>
+                    </a:stretch>
+                  </pic:blipFill>
+                  <pic:spPr>
+                    <a:xfrm>
+                      <a:off x="0" y="0"/>
+                      <a:ext cx="5731510" cy="2073910"/>
+                    </a:xfrm>
+                    <a:prstGeom prst="rect">
+                      <a:avLst/>
+                    </a:prstGeom>
+                  </pic:spPr>
+                </pic:pic>
+              </a:graphicData>
+            </a:graphic>
+          </wp:inline>
+        </w:drawing>
+      </w:r>
+    </w:p>
+    <w:p/>
+    <w:p>
+      <w:pPr>
+        <w:pStyle w:val="Heading2"/>
       </w:pPr>
       <w:r>
-        <w:t xml:space="preserve">Constraints were added to the “account_id” to designate it as the primary key for this table which also creates an index for it by default, ‘UNIQUE’ constraints were added to the ‘email’ and ‘username’ columns to ensure that </w:t>
-      </w:r>
-    </w:p>
+        <w:t>Test Data and Querying</w:t>
+      </w:r>
+    </w:p>
+    <w:p>
+      <w:r>
+        <w:t xml:space="preserve">WC - </w:t>
+      </w:r>
+      <w:r>
+        <w:t>2</w:t>
+      </w:r>
+      <w:r>
+        <w:t>55</w:t>
+      </w:r>
+    </w:p>
+    <w:p>
+      <w:r>
+        <w:t>Realistic test data was created to support development and validate database functionality. An initial set of manually crafted records covered key scenarios, including users owning multiple games, publishers managing several titles, and reviews with varied ratings. This data included meaningful values such as usernames, profile pictures, descriptive game details, and system requirements.</w:t>
+      </w:r>
+    </w:p>
+    <w:p>
+      <w:r>
+        <w:t>To scale the dataset, a Python script using the Faker library generated over 100 accounts, 50 games, 10 publishers, and hundreds of related records, such as reviews, friendships, chat messages, and game ownership data. Data complexity was increased through special characters, varied data types, and enforced foreign key constraints to maintain referential integrity.</w:t>
+      </w:r>
+    </w:p>
+    <w:p>
+      <w:r>
+        <w:t xml:space="preserve">A range of SQL queries were written to test functionality and performance, including SELECT statements with JOINs, subqueries, and Common Table Expressions (CTEs) for more complex logic. Aggregate functions such as </w:t>
+      </w:r>
+      <w:proofErr w:type="gramStart"/>
+      <w:r>
+        <w:t>COUNT(</w:t>
+      </w:r>
+      <w:proofErr w:type="gramEnd"/>
+      <w:r>
+        <w:t>), AVG(), DATEDIFF(), GROUP BY with HAVING, and LIMIT were used to generate meaningful results.</w:t>
+      </w:r>
+    </w:p>
+    <w:p>
+      <w:r>
+        <w:t>Query performance was analysed using EXPLAIN, confirming efficient use of indexes on key fields like username, email, and foreign keys.</w:t>
+      </w:r>
+    </w:p>
+    <w:p>
+      <w:r>
+        <w:rPr>
+          <w:noProof/>
+        </w:rPr>
+        <w:lastRenderedPageBreak/>
+        <w:drawing>
+          <wp:inline distT="0" distB="0" distL="0" distR="0" wp14:anchorId="18459F4C" wp14:editId="41FCD849">
+            <wp:extent cx="5731510" cy="1302385"/>
+            <wp:effectExtent l="0" t="0" r="0" b="5715"/>
+            <wp:docPr id="1589736123" name="Picture 4" descr="A screen shot of a computer program&#10;&#10;AI-generated content may be incorrect."/>
+            <wp:cNvGraphicFramePr>
+              <a:graphicFrameLocks xmlns:a="http://schemas.openxmlformats.org/drawingml/2006/main" noChangeAspect="1"/>
+            </wp:cNvGraphicFramePr>
+            <a:graphic xmlns:a="http://schemas.openxmlformats.org/drawingml/2006/main">
+              <a:graphicData uri="http://schemas.openxmlformats.org/drawingml/2006/picture">
+                <pic:pic xmlns:pic="http://schemas.openxmlformats.org/drawingml/2006/picture">
+                  <pic:nvPicPr>
+                    <pic:cNvPr id="1589736123" name="Picture 4" descr="A screen shot of a computer program&#10;&#10;AI-generated content may be incorrect."/>
+                    <pic:cNvPicPr/>
+                  </pic:nvPicPr>
+                  <pic:blipFill>
+                    <a:blip r:embed="rId10">
+                      <a:extLst>
+                        <a:ext uri="{28A0092B-C50C-407E-A947-70E740481C1C}">
+                          <a14:useLocalDpi xmlns:a14="http://schemas.microsoft.com/office/drawing/2010/main" val="0"/>
+                        </a:ext>
+                      </a:extLst>
+                    </a:blip>
+                    <a:stretch>
+                      <a:fillRect/>
+                    </a:stretch>
+                  </pic:blipFill>
+                  <pic:spPr>
+                    <a:xfrm>
+                      <a:off x="0" y="0"/>
+                      <a:ext cx="5731510" cy="1302385"/>
+                    </a:xfrm>
+                    <a:prstGeom prst="rect">
+                      <a:avLst/>
+                    </a:prstGeom>
+                  </pic:spPr>
+                </pic:pic>
+              </a:graphicData>
+            </a:graphic>
+          </wp:inline>
+        </w:drawing>
+      </w:r>
+      <w:r>
+        <w:rPr>
+          <w:noProof/>
+        </w:rPr>
+        <w:drawing>
+          <wp:inline distT="0" distB="0" distL="0" distR="0" wp14:anchorId="1C0252C5" wp14:editId="202E18C6">
+            <wp:extent cx="5731510" cy="1569685"/>
+            <wp:effectExtent l="0" t="0" r="0" b="5715"/>
+            <wp:docPr id="1419658629" name="Picture 5" descr="A black screen with white text&#10;&#10;AI-generated content may be incorrect."/>
+            <wp:cNvGraphicFramePr>
+              <a:graphicFrameLocks xmlns:a="http://schemas.openxmlformats.org/drawingml/2006/main" noChangeAspect="1"/>
+            </wp:cNvGraphicFramePr>
+            <a:graphic xmlns:a="http://schemas.openxmlformats.org/drawingml/2006/main">
+              <a:graphicData uri="http://schemas.openxmlformats.org/drawingml/2006/picture">
+                <pic:pic xmlns:pic="http://schemas.openxmlformats.org/drawingml/2006/picture">
+                  <pic:nvPicPr>
+                    <pic:cNvPr id="1419658629" name="Picture 5" descr="A black screen with white text&#10;&#10;AI-generated content may be incorrect."/>
+                    <pic:cNvPicPr/>
+                  </pic:nvPicPr>
+                  <pic:blipFill>
+                    <a:blip r:embed="rId11">
+                      <a:extLst>
+                        <a:ext uri="{28A0092B-C50C-407E-A947-70E740481C1C}">
+                          <a14:useLocalDpi xmlns:a14="http://schemas.microsoft.com/office/drawing/2010/main" val="0"/>
+                        </a:ext>
+                      </a:extLst>
+                    </a:blip>
+                    <a:stretch>
+                      <a:fillRect/>
+                    </a:stretch>
+                  </pic:blipFill>
+                  <pic:spPr>
+                    <a:xfrm>
+                      <a:off x="0" y="0"/>
+                      <a:ext cx="5779639" cy="1582866"/>
+                    </a:xfrm>
+                    <a:prstGeom prst="rect">
+                      <a:avLst/>
+                    </a:prstGeom>
+                  </pic:spPr>
+                </pic:pic>
+              </a:graphicData>
+            </a:graphic>
+          </wp:inline>
+        </w:drawing>
+      </w:r>
+    </w:p>
+    <w:p>
+      <w:r>
+        <w:t xml:space="preserve">Data export and backup were automated using a Python script that ran </w:t>
+      </w:r>
+      <w:proofErr w:type="spellStart"/>
+      <w:r>
+        <w:t>mysqldump</w:t>
+      </w:r>
+      <w:proofErr w:type="spellEnd"/>
+      <w:r>
+        <w:t xml:space="preserve"> within the Docker container using docker exec, saving the output to a .</w:t>
+      </w:r>
+      <w:proofErr w:type="spellStart"/>
+      <w:r>
+        <w:t>sql</w:t>
+      </w:r>
+      <w:proofErr w:type="spellEnd"/>
+      <w:r>
+        <w:t xml:space="preserve"> file on the host machine. On a local installation of MySQL, the same process could be performed directly using</w:t>
+      </w:r>
+      <w:r>
+        <w:t>:</w:t>
+      </w:r>
+    </w:p>
+    <w:p>
+      <w:pPr>
+        <w:jc w:val="center"/>
+      </w:pPr>
+      <w:proofErr w:type="spellStart"/>
+      <w:r>
+        <w:t>mysqldump</w:t>
+      </w:r>
+      <w:proofErr w:type="spellEnd"/>
+      <w:r>
+        <w:t xml:space="preserve"> -u root -p marketplace &gt; </w:t>
+      </w:r>
+      <w:proofErr w:type="spellStart"/>
+      <w:r>
+        <w:t>marketplace_dump.sql</w:t>
+      </w:r>
+      <w:proofErr w:type="spellEnd"/>
+    </w:p>
+    <w:p>
+      <w:r>
+        <w:t>and restored using</w:t>
+      </w:r>
+      <w:r>
+        <w:t>:</w:t>
+      </w:r>
+    </w:p>
+    <w:p>
+      <w:pPr>
+        <w:jc w:val="center"/>
+      </w:pPr>
+      <w:proofErr w:type="spellStart"/>
+      <w:r>
+        <w:t>mysql</w:t>
+      </w:r>
+      <w:proofErr w:type="spellEnd"/>
+      <w:r>
+        <w:t xml:space="preserve"> -u root -p marketplace &lt; </w:t>
+      </w:r>
+      <w:proofErr w:type="spellStart"/>
+      <w:r>
+        <w:t>marketplace_dump.sql</w:t>
+      </w:r>
+      <w:proofErr w:type="spellEnd"/>
+    </w:p>
+    <w:p>
+      <w:r>
+        <w:t>ALTER TABLE statements were used during development to adapt the schema, and queries were incrementally tested to verify correctness and data integrity.</w:t>
+      </w:r>
+    </w:p>
+    <w:p/>
+    <w:p>
+      <w:pPr>
+        <w:pStyle w:val="Heading2"/>
+      </w:pPr>
+      <w:r>
+        <w:t>Challenges and Problem solving</w:t>
+      </w:r>
+    </w:p>
+    <w:p>
+      <w:r>
+        <w:t>WC - 1</w:t>
+      </w:r>
+      <w:r>
+        <w:t>27</w:t>
+      </w:r>
+    </w:p>
+    <w:p>
+      <w:r>
+        <w:t>Several challenges were encountered during development, particularly around maintaining referential integrity when inserting test data. Early attempts to insert records without considering foreign key dependencies led to constraint violations. This was resolved by ordering inserts carefully — creating parent records (e.g., account, publisher) before dependent tables like game or review.</w:t>
+      </w:r>
+    </w:p>
+    <w:p>
+      <w:r>
+        <w:t>Data type mismatches also caused errors, especially when inserting NULL values or exceeding defined VARCHAR lengths. These were resolved through validation and, where necessary, adjusting the schema.</w:t>
+      </w:r>
+    </w:p>
+    <w:p>
+      <w:r>
+        <w:t xml:space="preserve">Debugging was primarily carried out using JetBrains </w:t>
+      </w:r>
+      <w:proofErr w:type="spellStart"/>
+      <w:r>
+        <w:t>DataGrip</w:t>
+      </w:r>
+      <w:proofErr w:type="spellEnd"/>
+      <w:r>
+        <w:t xml:space="preserve">, supported by incremental testing of queries. </w:t>
+      </w:r>
+      <w:proofErr w:type="spellStart"/>
+      <w:r>
+        <w:t>DataGrip</w:t>
+      </w:r>
+      <w:proofErr w:type="spellEnd"/>
+      <w:r>
+        <w:t xml:space="preserve"> provided an advanced query editor and better </w:t>
+      </w:r>
+      <w:r>
+        <w:lastRenderedPageBreak/>
+        <w:t>integration with my development environment compared to MySQL Workbench. Additionally, the SHOW WARNINGS and SHOW GRANTS commands were particularly useful for diagnosing permission-related issues and resolving errors during testing.</w:t>
+      </w:r>
+    </w:p>
+    <w:p/>
+    <w:p>
+      <w:pPr>
+        <w:pStyle w:val="Heading2"/>
+      </w:pPr>
+      <w:r>
+        <w:t>Conclusion and Future Improvements</w:t>
+      </w:r>
+    </w:p>
+    <w:p>
+      <w:r>
+        <w:t>WC - 1</w:t>
+      </w:r>
+      <w:r>
+        <w:t>25</w:t>
+      </w:r>
+    </w:p>
+    <w:p>
+      <w:r>
+        <w:t>The implementation of this database demonstrated the importance of careful planning and consideration of relational structure before development. Decisions such as enforcing foreign keys, applying cascading behaviours appropriately, and using indexing on frequently queried fields were essential to maintaining data integrity and ensuring efficient query performance. The use of views and stored procedures provided a secure and maintainable way to encapsulate database logic and protect sensitive data.</w:t>
+      </w:r>
+    </w:p>
+    <w:p>
+      <w:r>
+        <w:t>Future improvements could include expanding security features, such as implementing password salting and additional input validation. As the database scales, further performance optimisations could be made through query analysis and refined indexing strategies. The automated data generation process could also be extended to simulate more complex user behaviour and larger datasets to support load testing or analytics requirements.</w:t>
+      </w:r>
+    </w:p>
+    <w:p/>
     <w:sectPr>
       <w:pgSz w:w="11906" w:h="16838"/>
       <w:pgMar w:top="1440" w:right="1440" w:bottom="1440" w:left="1440" w:header="708" w:footer="708" w:gutter="0"/>
@@ -242,8 +763,128 @@
 </w:document>
 </file>
 
+<file path=word/numbering.xml><?xml version="1.0" encoding="utf-8"?>
+<w:numbering xmlns:wpc="http://schemas.microsoft.com/office/word/2010/wordprocessingCanvas" xmlns:cx="http://schemas.microsoft.com/office/drawing/2014/chartex" xmlns:cx1="http://schemas.microsoft.com/office/drawing/2015/9/8/chartex" xmlns:cx2="http://schemas.microsoft.com/office/drawing/2015/10/21/chartex" xmlns:cx3="http://schemas.microsoft.com/office/drawing/2016/5/9/chartex" xmlns:cx4="http://schemas.microsoft.com/office/drawing/2016/5/10/chartex" xmlns:cx5="http://schemas.microsoft.com/office/drawing/2016/5/11/chartex" xmlns:cx6="http://schemas.microsoft.com/office/drawing/2016/5/12/chartex" xmlns:cx7="http://schemas.microsoft.com/office/drawing/2016/5/13/chartex" xmlns:cx8="http://schemas.microsoft.com/office/drawing/2016/5/14/chartex" xmlns:mc="http://schemas.openxmlformats.org/markup-compatibility/2006" xmlns:aink="http://schemas.microsoft.com/office/drawing/2016/ink" xmlns:am3d="http://schemas.microsoft.com/office/drawing/2017/model3d" xmlns:o="urn:schemas-microsoft-com:office:office" xmlns:oel="http://schemas.microsoft.com/office/2019/extlst" xmlns:r="http://schemas.openxmlformats.org/officeDocument/2006/relationships" xmlns:m="http://schemas.openxmlformats.org/officeDocument/2006/math" xmlns:v="urn:schemas-microsoft-com:vml" xmlns:wp14="http://schemas.microsoft.com/office/word/2010/wordprocessingDrawing" xmlns:wp="http://schemas.openxmlformats.org/drawingml/2006/wordprocessingDrawing" xmlns:w10="urn:schemas-microsoft-com:office:word" xmlns:w="http://schemas.openxmlformats.org/wordprocessingml/2006/main" xmlns:w14="http://schemas.microsoft.com/office/word/2010/wordml" xmlns:w15="http://schemas.microsoft.com/office/word/2012/wordml" xmlns:w16cex="http://schemas.microsoft.com/office/word/2018/wordml/cex" xmlns:w16cid="http://schemas.microsoft.com/office/word/2016/wordml/cid" xmlns:w16="http://schemas.microsoft.com/office/word/2018/wordml" xmlns:w16du="http://schemas.microsoft.com/office/word/2023/wordml/word16du" xmlns:w16sdtdh="http://schemas.microsoft.com/office/word/2020/wordml/sdtdatahash" xmlns:w16se="http://schemas.microsoft.com/office/word/2015/wordml/symex" xmlns:wpg="http://schemas.microsoft.com/office/word/2010/wordprocessingGroup" xmlns:wpi="http://schemas.microsoft.com/office/word/2010/wordprocessingInk" xmlns:wne="http://schemas.microsoft.com/office/word/2006/wordml" xmlns:wps="http://schemas.microsoft.com/office/word/2010/wordprocessingShape" mc:Ignorable="w14 w15 w16se w16cid w16 w16cex w16sdtdh w16du wp14">
+  <w:abstractNum w:abstractNumId="0" w15:restartNumberingAfterBreak="0">
+    <w:nsid w:val="3BE16075"/>
+    <w:multiLevelType w:val="hybridMultilevel"/>
+    <w:tmpl w:val="7AAA45D0"/>
+    <w:lvl w:ilvl="0" w:tplc="AF2CBD0E">
+      <w:numFmt w:val="bullet"/>
+      <w:lvlText w:val="-"/>
+      <w:lvlJc w:val="left"/>
+      <w:pPr>
+        <w:ind w:left="720" w:hanging="360"/>
+      </w:pPr>
+      <w:rPr>
+        <w:rFonts w:ascii="Aptos" w:eastAsiaTheme="minorHAnsi" w:hAnsi="Aptos" w:cstheme="minorBidi" w:hint="default"/>
+      </w:rPr>
+    </w:lvl>
+    <w:lvl w:ilvl="1" w:tplc="08090003" w:tentative="1">
+      <w:start w:val="1"/>
+      <w:numFmt w:val="bullet"/>
+      <w:lvlText w:val="o"/>
+      <w:lvlJc w:val="left"/>
+      <w:pPr>
+        <w:ind w:left="1440" w:hanging="360"/>
+      </w:pPr>
+      <w:rPr>
+        <w:rFonts w:ascii="Courier New" w:hAnsi="Courier New" w:cs="Courier New" w:hint="default"/>
+      </w:rPr>
+    </w:lvl>
+    <w:lvl w:ilvl="2" w:tplc="08090005" w:tentative="1">
+      <w:start w:val="1"/>
+      <w:numFmt w:val="bullet"/>
+      <w:lvlText w:val=""/>
+      <w:lvlJc w:val="left"/>
+      <w:pPr>
+        <w:ind w:left="2160" w:hanging="360"/>
+      </w:pPr>
+      <w:rPr>
+        <w:rFonts w:ascii="Wingdings" w:hAnsi="Wingdings" w:hint="default"/>
+      </w:rPr>
+    </w:lvl>
+    <w:lvl w:ilvl="3" w:tplc="08090001" w:tentative="1">
+      <w:start w:val="1"/>
+      <w:numFmt w:val="bullet"/>
+      <w:lvlText w:val=""/>
+      <w:lvlJc w:val="left"/>
+      <w:pPr>
+        <w:ind w:left="2880" w:hanging="360"/>
+      </w:pPr>
+      <w:rPr>
+        <w:rFonts w:ascii="Symbol" w:hAnsi="Symbol" w:hint="default"/>
+      </w:rPr>
+    </w:lvl>
+    <w:lvl w:ilvl="4" w:tplc="08090003" w:tentative="1">
+      <w:start w:val="1"/>
+      <w:numFmt w:val="bullet"/>
+      <w:lvlText w:val="o"/>
+      <w:lvlJc w:val="left"/>
+      <w:pPr>
+        <w:ind w:left="3600" w:hanging="360"/>
+      </w:pPr>
+      <w:rPr>
+        <w:rFonts w:ascii="Courier New" w:hAnsi="Courier New" w:cs="Courier New" w:hint="default"/>
+      </w:rPr>
+    </w:lvl>
+    <w:lvl w:ilvl="5" w:tplc="08090005" w:tentative="1">
+      <w:start w:val="1"/>
+      <w:numFmt w:val="bullet"/>
+      <w:lvlText w:val=""/>
+      <w:lvlJc w:val="left"/>
+      <w:pPr>
+        <w:ind w:left="4320" w:hanging="360"/>
+      </w:pPr>
+      <w:rPr>
+        <w:rFonts w:ascii="Wingdings" w:hAnsi="Wingdings" w:hint="default"/>
+      </w:rPr>
+    </w:lvl>
+    <w:lvl w:ilvl="6" w:tplc="08090001" w:tentative="1">
+      <w:start w:val="1"/>
+      <w:numFmt w:val="bullet"/>
+      <w:lvlText w:val=""/>
+      <w:lvlJc w:val="left"/>
+      <w:pPr>
+        <w:ind w:left="5040" w:hanging="360"/>
+      </w:pPr>
+      <w:rPr>
+        <w:rFonts w:ascii="Symbol" w:hAnsi="Symbol" w:hint="default"/>
+      </w:rPr>
+    </w:lvl>
+    <w:lvl w:ilvl="7" w:tplc="08090003" w:tentative="1">
+      <w:start w:val="1"/>
+      <w:numFmt w:val="bullet"/>
+      <w:lvlText w:val="o"/>
+      <w:lvlJc w:val="left"/>
+      <w:pPr>
+        <w:ind w:left="5760" w:hanging="360"/>
+      </w:pPr>
+      <w:rPr>
+        <w:rFonts w:ascii="Courier New" w:hAnsi="Courier New" w:cs="Courier New" w:hint="default"/>
+      </w:rPr>
+    </w:lvl>
+    <w:lvl w:ilvl="8" w:tplc="08090005" w:tentative="1">
+      <w:start w:val="1"/>
+      <w:numFmt w:val="bullet"/>
+      <w:lvlText w:val=""/>
+      <w:lvlJc w:val="left"/>
+      <w:pPr>
+        <w:ind w:left="6480" w:hanging="360"/>
+      </w:pPr>
+      <w:rPr>
+        <w:rFonts w:ascii="Wingdings" w:hAnsi="Wingdings" w:hint="default"/>
+      </w:rPr>
+    </w:lvl>
+  </w:abstractNum>
+  <w:num w:numId="1" w16cid:durableId="997004981">
+    <w:abstractNumId w:val="0"/>
+  </w:num>
+</w:numbering>
+</file>
+
 <file path=word/styles.xml><?xml version="1.0" encoding="utf-8"?>
-<w:styles xmlns:mc="http://schemas.openxmlformats.org/markup-compatibility/2006" xmlns:r="http://schemas.openxmlformats.org/officeDocument/2006/relationships" xmlns:w="http://schemas.openxmlformats.org/wordprocessingml/2006/main" xmlns:w14="http://schemas.microsoft.com/office/word/2010/wordml" xmlns:w15="http://schemas.microsoft.com/office/word/2012/wordml" xmlns:w16cex="http://schemas.microsoft.com/office/word/2018/wordml/cex" xmlns:w16cid="http://schemas.microsoft.com/office/word/2016/wordml/cid" xmlns:w16="http://schemas.microsoft.com/office/word/2018/wordml" xmlns:w16du="http://schemas.microsoft.com/office/word/2023/wordml/word16du" xmlns:w16sdtdh="http://schemas.microsoft.com/office/word/2020/wordml/sdtdatahash" xmlns:w16sdtfl="http://schemas.microsoft.com/office/word/2024/wordml/sdtformatlock" xmlns:w16se="http://schemas.microsoft.com/office/word/2015/wordml/symex" mc:Ignorable="w14 w15 w16se w16cid w16 w16cex w16sdtdh w16sdtfl w16du">
+<w:styles xmlns:mc="http://schemas.openxmlformats.org/markup-compatibility/2006" xmlns:r="http://schemas.openxmlformats.org/officeDocument/2006/relationships" xmlns:w="http://schemas.openxmlformats.org/wordprocessingml/2006/main" xmlns:w14="http://schemas.microsoft.com/office/word/2010/wordml" xmlns:w15="http://schemas.microsoft.com/office/word/2012/wordml" xmlns:w16cex="http://schemas.microsoft.com/office/word/2018/wordml/cex" xmlns:w16cid="http://schemas.microsoft.com/office/word/2016/wordml/cid" xmlns:w16="http://schemas.microsoft.com/office/word/2018/wordml" xmlns:w16du="http://schemas.microsoft.com/office/word/2023/wordml/word16du" xmlns:w16sdtdh="http://schemas.microsoft.com/office/word/2020/wordml/sdtdatahash" xmlns:w16se="http://schemas.microsoft.com/office/word/2015/wordml/symex" mc:Ignorable="w14 w15 w16se w16cid w16 w16cex w16sdtdh w16du">
   <w:docDefaults>
     <w:rPrDefault>
       <w:rPr>
@@ -670,7 +1311,6 @@
     <w:next w:val="Normal"/>
     <w:link w:val="Heading2Char"/>
     <w:uiPriority w:val="9"/>
-    <w:semiHidden/>
     <w:unhideWhenUsed/>
     <w:qFormat/>
     <w:rsid w:val="00407BF0"/>
@@ -845,7 +1485,6 @@
   <w:style w:type="character" w:default="1" w:styleId="DefaultParagraphFont">
     <w:name w:val="Default Paragraph Font"/>
     <w:uiPriority w:val="1"/>
-    <w:semiHidden/>
     <w:unhideWhenUsed/>
   </w:style>
   <w:style w:type="table" w:default="1" w:styleId="TableNormal">
@@ -887,7 +1526,6 @@
     <w:basedOn w:val="DefaultParagraphFont"/>
     <w:link w:val="Heading2"/>
     <w:uiPriority w:val="9"/>
-    <w:semiHidden/>
     <w:rsid w:val="00407BF0"/>
     <w:rPr>
       <w:rFonts w:asciiTheme="majorHAnsi" w:eastAsiaTheme="majorEastAsia" w:hAnsiTheme="majorHAnsi" w:cstheme="majorBidi"/>
@@ -1158,6 +1796,11 @@
       <w:color w:val="0F4761" w:themeColor="accent1" w:themeShade="BF"/>
       <w:spacing w:val="5"/>
     </w:rPr>
+  </w:style>
+  <w:style w:type="character" w:customStyle="1" w:styleId="s1">
+    <w:name w:val="s1"/>
+    <w:basedOn w:val="DefaultParagraphFont"/>
+    <w:rsid w:val="0022244A"/>
   </w:style>
 </w:styles>
 </file>

</xml_diff>